<commit_message>
docs: personalizar y diferenciar evidencia individual de Fase 2 para Alexander Saez
</commit_message>
<xml_diff>
--- a/docs/Fase 1 Casptone/Evidencias Individuales/Alexander Sáez/Saez_Alexander_1.1_APT122_AutoevaluacionCompetenciasFase1.docx
+++ b/docs/Fase 1 Casptone/Evidencias Individuales/Alexander Sáez/Saez_Alexander_1.1_APT122_AutoevaluacionCompetenciasFase1.docx
@@ -16,7 +16,7 @@
           <w:noProof/>
         </w:rPr>
         <w:drawing>
-          <wp:anchor distT="0" distB="0" distL="114300" distR="114300" simplePos="0" relativeHeight="251658240" behindDoc="0" locked="0" layoutInCell="1" allowOverlap="0" wp14:anchorId="62F37FF2" wp14:editId="32804925">
+          <wp:anchor distT="0" distB="0" distL="114300" distR="114300" simplePos="0" relativeHeight="251658240" behindDoc="0" locked="0" layoutInCell="1" allowOverlap="0" wp14:anchorId="55F2ACF1" wp14:editId="59E17A22">
             <wp:simplePos x="0" y="0"/>
             <wp:positionH relativeFrom="column">
               <wp:posOffset>4336733</wp:posOffset>
@@ -331,7 +331,7 @@
         <mc:AlternateContent>
           <mc:Choice Requires="wpg">
             <w:drawing>
-              <wp:anchor distT="0" distB="0" distL="114300" distR="114300" simplePos="0" relativeHeight="251659264" behindDoc="0" locked="0" layoutInCell="1" allowOverlap="1" wp14:anchorId="7E82EF4C" wp14:editId="0023352B">
+              <wp:anchor distT="0" distB="0" distL="114300" distR="114300" simplePos="0" relativeHeight="251659264" behindDoc="0" locked="0" layoutInCell="1" allowOverlap="1" wp14:anchorId="3A17495C" wp14:editId="2A66348D">
                 <wp:simplePos x="0" y="0"/>
                 <wp:positionH relativeFrom="page">
                   <wp:posOffset>9525</wp:posOffset>
@@ -1410,7 +1410,7 @@
           <w:noProof/>
         </w:rPr>
         <w:drawing>
-          <wp:anchor distT="0" distB="0" distL="114300" distR="114300" simplePos="0" relativeHeight="251660288" behindDoc="0" locked="0" layoutInCell="1" allowOverlap="0" wp14:anchorId="61BB5E27" wp14:editId="6C17EC76">
+          <wp:anchor distT="0" distB="0" distL="114300" distR="114300" simplePos="0" relativeHeight="251660288" behindDoc="0" locked="0" layoutInCell="1" allowOverlap="0" wp14:anchorId="2DFACECE" wp14:editId="09DC768D">
             <wp:simplePos x="0" y="0"/>
             <wp:positionH relativeFrom="column">
               <wp:posOffset>4336733</wp:posOffset>
@@ -2018,7 +2018,7 @@
         <mc:AlternateContent>
           <mc:Choice Requires="wpg">
             <w:drawing>
-              <wp:anchor distT="0" distB="0" distL="114300" distR="114300" simplePos="0" relativeHeight="251661312" behindDoc="0" locked="0" layoutInCell="1" allowOverlap="1" wp14:anchorId="6CD7617A" wp14:editId="1DC373D8">
+              <wp:anchor distT="0" distB="0" distL="114300" distR="114300" simplePos="0" relativeHeight="251661312" behindDoc="0" locked="0" layoutInCell="1" allowOverlap="1" wp14:anchorId="69BCBE29" wp14:editId="08D81AEB">
                 <wp:simplePos x="0" y="0"/>
                 <wp:positionH relativeFrom="page">
                   <wp:posOffset>9525</wp:posOffset>
@@ -2961,7 +2961,11 @@
             </w:tcBorders>
           </w:tcPr>
           <w:p>
-            <w:r/>
+            <w:pPr>
+              <w:rPr>
+                <w:lang w:val="es-CL"/>
+              </w:rPr>
+            </w:pPr>
           </w:p>
         </w:tc>
         <w:tc>
@@ -2975,7 +2979,11 @@
             </w:tcBorders>
           </w:tcPr>
           <w:p>
-            <w:r/>
+            <w:pPr>
+              <w:rPr>
+                <w:lang w:val="es-CL"/>
+              </w:rPr>
+            </w:pPr>
           </w:p>
         </w:tc>
         <w:tc>
@@ -3004,9 +3012,7 @@
               <w:right w:val="single" w:sz="4" w:space="0" w:color="BFBFBF"/>
             </w:tcBorders>
           </w:tcPr>
-          <w:p>
-            <w:r/>
-          </w:p>
+          <w:p/>
         </w:tc>
         <w:tc>
           <w:tcPr>
@@ -3018,9 +3024,7 @@
               <w:right w:val="single" w:sz="4" w:space="0" w:color="BFBFBF"/>
             </w:tcBorders>
           </w:tcPr>
-          <w:p>
-            <w:r/>
-          </w:p>
+          <w:p/>
         </w:tc>
         <w:tc>
           <w:tcPr>
@@ -3033,7 +3037,19 @@
             </w:tcBorders>
           </w:tcPr>
           <w:p>
-            <w:r>
+            <w:pPr>
+              <w:rPr>
+                <w:sz w:val="20"/>
+                <w:szCs w:val="18"/>
+                <w:lang w:val="es-CL"/>
+              </w:rPr>
+            </w:pPr>
+            <w:r>
+              <w:rPr>
+                <w:sz w:val="20"/>
+                <w:szCs w:val="18"/>
+                <w:lang w:val="es-CL"/>
+              </w:rPr>
               <w:t>Manejo la estructura y consumo de interfaces en React, pero mi fortaleza principal y foco técnico se concentran en persistencia y backend.</w:t>
             </w:r>
           </w:p>
@@ -3150,9 +3166,7 @@
               <w:right w:val="single" w:sz="4" w:space="0" w:color="BFBFBF"/>
             </w:tcBorders>
           </w:tcPr>
-          <w:p>
-            <w:r/>
-          </w:p>
+          <w:p/>
         </w:tc>
         <w:tc>
           <w:tcPr>
@@ -3164,9 +3178,7 @@
               <w:right w:val="single" w:sz="4" w:space="0" w:color="BFBFBF"/>
             </w:tcBorders>
           </w:tcPr>
-          <w:p>
-            <w:r/>
-          </w:p>
+          <w:p/>
         </w:tc>
         <w:tc>
           <w:tcPr>
@@ -3178,9 +3190,7 @@
               <w:right w:val="single" w:sz="4" w:space="0" w:color="BFBFBF"/>
             </w:tcBorders>
           </w:tcPr>
-          <w:p>
-            <w:r/>
-          </w:p>
+          <w:p/>
         </w:tc>
         <w:tc>
           <w:tcPr>
@@ -3192,9 +3202,7 @@
               <w:right w:val="single" w:sz="4" w:space="0" w:color="BFBFBF"/>
             </w:tcBorders>
           </w:tcPr>
-          <w:p>
-            <w:r/>
-          </w:p>
+          <w:p/>
         </w:tc>
         <w:tc>
           <w:tcPr>
@@ -3207,7 +3215,19 @@
             </w:tcBorders>
           </w:tcPr>
           <w:p>
-            <w:r>
+            <w:pPr>
+              <w:rPr>
+                <w:sz w:val="20"/>
+                <w:szCs w:val="18"/>
+                <w:lang w:val="es-CL"/>
+              </w:rPr>
+            </w:pPr>
+            <w:r>
+              <w:rPr>
+                <w:sz w:val="20"/>
+                <w:szCs w:val="18"/>
+                <w:lang w:val="es-CL"/>
+              </w:rPr>
               <w:t>Sólido dominio en arquitectura de APIs con FastAPI, esquemas Pydantic, ORM SQLAlchemy y desarrollo asíncrono.</w:t>
             </w:r>
           </w:p>
@@ -3281,7 +3301,11 @@
             </w:tcBorders>
           </w:tcPr>
           <w:p>
-            <w:r/>
+            <w:pPr>
+              <w:rPr>
+                <w:lang w:val="es-CL"/>
+              </w:rPr>
+            </w:pPr>
           </w:p>
         </w:tc>
         <w:tc>
@@ -3310,9 +3334,7 @@
               <w:right w:val="single" w:sz="4" w:space="0" w:color="BFBFBF"/>
             </w:tcBorders>
           </w:tcPr>
-          <w:p>
-            <w:r/>
-          </w:p>
+          <w:p/>
         </w:tc>
         <w:tc>
           <w:tcPr>
@@ -3324,9 +3346,7 @@
               <w:right w:val="single" w:sz="4" w:space="0" w:color="BFBFBF"/>
             </w:tcBorders>
           </w:tcPr>
-          <w:p>
-            <w:r/>
-          </w:p>
+          <w:p/>
         </w:tc>
         <w:tc>
           <w:tcPr>
@@ -3338,9 +3358,7 @@
               <w:right w:val="single" w:sz="4" w:space="0" w:color="BFBFBF"/>
             </w:tcBorders>
           </w:tcPr>
-          <w:p>
-            <w:r/>
-          </w:p>
+          <w:p/>
         </w:tc>
         <w:tc>
           <w:tcPr>
@@ -3353,7 +3371,19 @@
             </w:tcBorders>
           </w:tcPr>
           <w:p>
-            <w:r>
+            <w:pPr>
+              <w:rPr>
+                <w:sz w:val="20"/>
+                <w:szCs w:val="18"/>
+                <w:lang w:val="es-CL"/>
+              </w:rPr>
+            </w:pPr>
+            <w:r>
+              <w:rPr>
+                <w:sz w:val="20"/>
+                <w:szCs w:val="18"/>
+                <w:lang w:val="es-CL"/>
+              </w:rPr>
               <w:t>Experiencia práctica aprovisionando e integrando Neon Serverless PostgreSQL, manejo de variables de entorno, pools de conexión y despliegues.</w:t>
             </w:r>
           </w:p>
@@ -3419,7 +3449,11 @@
             </w:tcBorders>
           </w:tcPr>
           <w:p>
-            <w:r/>
+            <w:pPr>
+              <w:rPr>
+                <w:lang w:val="es-CL"/>
+              </w:rPr>
+            </w:pPr>
           </w:p>
         </w:tc>
         <w:tc>
@@ -3433,7 +3467,11 @@
             </w:tcBorders>
           </w:tcPr>
           <w:p>
-            <w:r/>
+            <w:pPr>
+              <w:rPr>
+                <w:lang w:val="es-CL"/>
+              </w:rPr>
+            </w:pPr>
           </w:p>
         </w:tc>
         <w:tc>
@@ -3462,9 +3500,7 @@
               <w:right w:val="single" w:sz="4" w:space="0" w:color="BFBFBF"/>
             </w:tcBorders>
           </w:tcPr>
-          <w:p>
-            <w:r/>
-          </w:p>
+          <w:p/>
         </w:tc>
         <w:tc>
           <w:tcPr>
@@ -3476,9 +3512,7 @@
               <w:right w:val="single" w:sz="4" w:space="0" w:color="BFBFBF"/>
             </w:tcBorders>
           </w:tcPr>
-          <w:p>
-            <w:r/>
-          </w:p>
+          <w:p/>
         </w:tc>
         <w:tc>
           <w:tcPr>
@@ -3491,7 +3525,19 @@
             </w:tcBorders>
           </w:tcPr>
           <w:p>
-            <w:r>
+            <w:pPr>
+              <w:rPr>
+                <w:sz w:val="20"/>
+                <w:szCs w:val="18"/>
+                <w:lang w:val="es-CL"/>
+              </w:rPr>
+            </w:pPr>
+            <w:r>
+              <w:rPr>
+                <w:sz w:val="20"/>
+                <w:szCs w:val="18"/>
+                <w:lang w:val="es-CL"/>
+              </w:rPr>
               <w:t>Validación de endpoints y consistencia de datos en bases de datos; requiero seguir profundizando en testing automatizado continuo.</w:t>
             </w:r>
           </w:p>
@@ -3548,7 +3594,11 @@
             </w:tcBorders>
           </w:tcPr>
           <w:p>
-            <w:r/>
+            <w:pPr>
+              <w:rPr>
+                <w:lang w:val="es-CL"/>
+              </w:rPr>
+            </w:pPr>
           </w:p>
         </w:tc>
         <w:tc>
@@ -3577,9 +3627,7 @@
               <w:right w:val="single" w:sz="4" w:space="0" w:color="BFBFBF"/>
             </w:tcBorders>
           </w:tcPr>
-          <w:p>
-            <w:r/>
-          </w:p>
+          <w:p/>
         </w:tc>
         <w:tc>
           <w:tcPr>
@@ -3591,9 +3639,7 @@
               <w:right w:val="single" w:sz="4" w:space="0" w:color="BFBFBF"/>
             </w:tcBorders>
           </w:tcPr>
-          <w:p>
-            <w:r/>
-          </w:p>
+          <w:p/>
         </w:tc>
         <w:tc>
           <w:tcPr>
@@ -3605,9 +3651,7 @@
               <w:right w:val="single" w:sz="4" w:space="0" w:color="BFBFBF"/>
             </w:tcBorders>
           </w:tcPr>
-          <w:p>
-            <w:r/>
-          </w:p>
+          <w:p/>
         </w:tc>
         <w:tc>
           <w:tcPr>
@@ -3620,7 +3664,19 @@
             </w:tcBorders>
           </w:tcPr>
           <w:p>
-            <w:r>
+            <w:pPr>
+              <w:rPr>
+                <w:sz w:val="20"/>
+                <w:szCs w:val="18"/>
+                <w:lang w:val="es-CL"/>
+              </w:rPr>
+            </w:pPr>
+            <w:r>
+              <w:rPr>
+                <w:sz w:val="20"/>
+                <w:szCs w:val="18"/>
+                <w:lang w:val="es-CL"/>
+              </w:rPr>
               <w:t>Uso activo y constante de metodología Kanban en Notion, gestión de sprints y control de versiones colaborativo con Git.</w:t>
             </w:r>
           </w:p>
@@ -3654,6 +3710,7 @@
                 <w:sz w:val="22"/>
                 <w:lang w:val="es-CL"/>
               </w:rPr>
+              <w:lastRenderedPageBreak/>
               <w:t xml:space="preserve">6. Levantamiento y Análisis de Requerimientos </w:t>
             </w:r>
           </w:p>
@@ -3684,9 +3741,7 @@
               <w:right w:val="single" w:sz="4" w:space="0" w:color="BFBFBF"/>
             </w:tcBorders>
           </w:tcPr>
-          <w:p>
-            <w:r/>
-          </w:p>
+          <w:p/>
         </w:tc>
         <w:tc>
           <w:tcPr>
@@ -3698,9 +3753,7 @@
               <w:right w:val="single" w:sz="4" w:space="0" w:color="BFBFBF"/>
             </w:tcBorders>
           </w:tcPr>
-          <w:p>
-            <w:r/>
-          </w:p>
+          <w:p/>
         </w:tc>
         <w:tc>
           <w:tcPr>
@@ -3712,9 +3765,7 @@
               <w:right w:val="single" w:sz="4" w:space="0" w:color="BFBFBF"/>
             </w:tcBorders>
           </w:tcPr>
-          <w:p>
-            <w:r/>
-          </w:p>
+          <w:p/>
         </w:tc>
         <w:tc>
           <w:tcPr>
@@ -3726,9 +3777,7 @@
               <w:right w:val="single" w:sz="4" w:space="0" w:color="BFBFBF"/>
             </w:tcBorders>
           </w:tcPr>
-          <w:p>
-            <w:r/>
-          </w:p>
+          <w:p/>
         </w:tc>
         <w:tc>
           <w:tcPr>
@@ -3741,7 +3790,19 @@
             </w:tcBorders>
           </w:tcPr>
           <w:p>
-            <w:r>
+            <w:pPr>
+              <w:rPr>
+                <w:sz w:val="20"/>
+                <w:szCs w:val="18"/>
+                <w:lang w:val="es-CL"/>
+              </w:rPr>
+            </w:pPr>
+            <w:r>
+              <w:rPr>
+                <w:sz w:val="20"/>
+                <w:szCs w:val="18"/>
+                <w:lang w:val="es-CL"/>
+              </w:rPr>
               <w:t>Excelente capacidad para interpretar requerimientos funcionales y transformarlos en modelos de datos relacionales normalizados (DER) y reglas de negocio.</w:t>
             </w:r>
           </w:p>

</xml_diff>